<commit_message>
feat: phan tach tab dang vien du bi, khop thong ke va them proxy tai anh tranh loi CORS
</commit_message>
<xml_diff>
--- a/public/3. Mẫu 3. Bản nhận xét Đảng viên dự bị ĐTN.docx
+++ b/public/3. Mẫu 3. Bản nhận xét Đảng viên dự bị ĐTN.docx
@@ -26,18 +26,18 @@
               <w:rPr>
                 <w:rFonts w:ascii="Times New Roman" w:eastAsia="Times New Roman" w:hAnsi="Times New Roman" w:cs="Times New Roman"/>
                 <w:color w:val="000000"/>
-                <w:sz w:val="26"/>
-                <w:szCs w:val="26"/>
+                <w:sz w:val="28"/>
+                <w:szCs w:val="28"/>
               </w:rPr>
             </w:pPr>
             <w:r>
               <w:rPr>
                 <w:rFonts w:ascii="Times New Roman" w:eastAsia="Times New Roman" w:hAnsi="Times New Roman" w:cs="Times New Roman"/>
                 <w:color w:val="000000"/>
-                <w:sz w:val="26"/>
-                <w:szCs w:val="26"/>
-              </w:rPr>
-              <w:t>ĐOÀN TNCS HỒ CHÍ MINH</w:t>
+                <w:sz w:val="28"/>
+                <w:szCs w:val="28"/>
+              </w:rPr>
+              <w:t>ĐOÀN ĐẠI HỌC ĐÀ NẴNG</w:t>
             </w:r>
           </w:p>
           <w:p>
@@ -47,27 +47,6 @@
               <w:rPr>
                 <w:rFonts w:ascii="Times New Roman" w:eastAsia="Times New Roman" w:hAnsi="Times New Roman" w:cs="Times New Roman"/>
                 <w:color w:val="000000"/>
-                <w:sz w:val="26"/>
-                <w:szCs w:val="26"/>
-              </w:rPr>
-            </w:pPr>
-            <w:r>
-              <w:rPr>
-                <w:rFonts w:ascii="Times New Roman" w:eastAsia="Times New Roman" w:hAnsi="Times New Roman" w:cs="Times New Roman"/>
-                <w:color w:val="000000"/>
-                <w:sz w:val="26"/>
-                <w:szCs w:val="26"/>
-              </w:rPr>
-              <w:t>ĐẠI HỌC ĐÀ NẴNG</w:t>
-            </w:r>
-          </w:p>
-          <w:p>
-            <w:pPr>
-              <w:ind w:firstLine="72"/>
-              <w:jc w:val="center"/>
-              <w:rPr>
-                <w:rFonts w:ascii="Times New Roman" w:eastAsia="Times New Roman" w:hAnsi="Times New Roman" w:cs="Times New Roman"/>
-                <w:color w:val="000000"/>
                 <w:sz w:val="28"/>
                 <w:szCs w:val="28"/>
               </w:rPr>
@@ -78,8 +57,8 @@
                 <w:b/>
                 <w:bCs/>
                 <w:color w:val="000000"/>
-                <w:sz w:val="26"/>
-                <w:szCs w:val="26"/>
+                <w:sz w:val="28"/>
+                <w:szCs w:val="28"/>
               </w:rPr>
               <w:t>BCH ĐOÀN TRƯỜNG ĐH KINH TẾ</w:t>
             </w:r>
@@ -97,8 +76,8 @@
                 <w:b/>
                 <w:bCs/>
                 <w:color w:val="000000"/>
-                <w:sz w:val="28"/>
-                <w:szCs w:val="28"/>
+                <w:sz w:val="30"/>
+                <w:szCs w:val="30"/>
               </w:rPr>
             </w:pPr>
             <w:r>
@@ -108,21 +87,21 @@
                 <w:bCs/>
                 <w:noProof/>
                 <w:color w:val="000000"/>
-                <w:sz w:val="28"/>
-                <w:szCs w:val="28"/>
+                <w:sz w:val="30"/>
+                <w:szCs w:val="30"/>
               </w:rPr>
               <mc:AlternateContent>
                 <mc:Choice Requires="wps">
                   <w:drawing>
-                    <wp:anchor distT="0" distB="0" distL="114300" distR="114300" simplePos="0" relativeHeight="251659264" behindDoc="0" locked="0" layoutInCell="1" allowOverlap="1" wp14:anchorId="033139A8" wp14:editId="41BC53C9">
+                    <wp:anchor distT="0" distB="0" distL="114300" distR="114300" simplePos="0" relativeHeight="251659264" behindDoc="0" locked="0" layoutInCell="1" allowOverlap="1" wp14:anchorId="033139A8" wp14:editId="70BBA8FF">
                       <wp:simplePos x="0" y="0"/>
                       <wp:positionH relativeFrom="column">
-                        <wp:posOffset>413476</wp:posOffset>
+                        <wp:posOffset>328393</wp:posOffset>
                       </wp:positionH>
                       <wp:positionV relativeFrom="paragraph">
-                        <wp:posOffset>222069</wp:posOffset>
+                        <wp:posOffset>223618</wp:posOffset>
                       </wp:positionV>
-                      <wp:extent cx="2264228" cy="0"/>
+                      <wp:extent cx="2438400" cy="0"/>
                       <wp:effectExtent l="0" t="0" r="0" b="0"/>
                       <wp:wrapNone/>
                       <wp:docPr id="391324164" name="Straight Connector 1"/>
@@ -134,7 +113,7 @@
                             <wps:spPr>
                               <a:xfrm>
                                 <a:off x="0" y="0"/>
-                                <a:ext cx="2264228" cy="0"/>
+                                <a:ext cx="2438400" cy="0"/>
                               </a:xfrm>
                               <a:prstGeom prst="line">
                                 <a:avLst/>
@@ -158,12 +137,15 @@
                           </wps:wsp>
                         </a:graphicData>
                       </a:graphic>
+                      <wp14:sizeRelH relativeFrom="margin">
+                        <wp14:pctWidth>0</wp14:pctWidth>
+                      </wp14:sizeRelH>
                     </wp:anchor>
                   </w:drawing>
                 </mc:Choice>
                 <mc:Fallback>
                   <w:pict>
-                    <v:line w14:anchorId="4015CF1C" id="Straight Connector 1" o:spid="_x0000_s1026" style="position:absolute;z-index:251659264;visibility:visible;mso-wrap-style:square;mso-wrap-distance-left:9pt;mso-wrap-distance-top:0;mso-wrap-distance-right:9pt;mso-wrap-distance-bottom:0;mso-position-horizontal:absolute;mso-position-horizontal-relative:text;mso-position-vertical:absolute;mso-position-vertical-relative:text" from="32.55pt,17.5pt" to="210.85pt,17.5pt" o:gfxdata="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" strokecolor="black [3040]"/>
+                    <v:line w14:anchorId="532BD15A" id="Straight Connector 1" o:spid="_x0000_s1026" style="position:absolute;z-index:251659264;visibility:visible;mso-wrap-style:square;mso-width-percent:0;mso-wrap-distance-left:9pt;mso-wrap-distance-top:0;mso-wrap-distance-right:9pt;mso-wrap-distance-bottom:0;mso-position-horizontal:absolute;mso-position-horizontal-relative:text;mso-position-vertical:absolute;mso-position-vertical-relative:text;mso-width-percent:0;mso-width-relative:margin" from="25.85pt,17.6pt" to="217.85pt,17.6pt" o:gfxdata="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" strokecolor="black [3040]"/>
                   </w:pict>
                 </mc:Fallback>
               </mc:AlternateContent>
@@ -174,8 +156,8 @@
                 <w:b/>
                 <w:bCs/>
                 <w:color w:val="000000"/>
-                <w:sz w:val="28"/>
-                <w:szCs w:val="28"/>
+                <w:sz w:val="30"/>
+                <w:szCs w:val="30"/>
               </w:rPr>
               <w:t>ĐOÀN TNCS HỒ CHÍ MINH</w:t>
             </w:r>
@@ -414,8 +396,8 @@
               <w:jc w:val="right"/>
               <w:rPr>
                 <w:rFonts w:ascii="Times New Roman" w:eastAsia="Times New Roman" w:hAnsi="Times New Roman" w:cs="Times New Roman"/>
-                <w:sz w:val="26"/>
-                <w:szCs w:val="26"/>
+                <w:sz w:val="28"/>
+                <w:szCs w:val="28"/>
               </w:rPr>
             </w:pPr>
             <w:r>
@@ -423,8 +405,8 @@
                 <w:rFonts w:ascii="Times New Roman" w:eastAsia="Times New Roman" w:hAnsi="Times New Roman" w:cs="Times New Roman"/>
                 <w:i/>
                 <w:iCs/>
-                <w:sz w:val="26"/>
-                <w:szCs w:val="26"/>
+                <w:sz w:val="28"/>
+                <w:szCs w:val="28"/>
               </w:rPr>
               <w:t>Kính gửi:</w:t>
             </w:r>
@@ -439,8 +421,8 @@
               <w:spacing w:before="60" w:after="60"/>
               <w:rPr>
                 <w:rFonts w:ascii="Times New Roman" w:eastAsia="Times New Roman" w:hAnsi="Times New Roman" w:cs="Times New Roman"/>
-                <w:sz w:val="26"/>
-                <w:szCs w:val="26"/>
+                <w:sz w:val="28"/>
+                <w:szCs w:val="28"/>
               </w:rPr>
             </w:pPr>
             <w:r>
@@ -448,16 +430,16 @@
                 <w:rFonts w:ascii="Times New Roman" w:eastAsia="Times New Roman" w:hAnsi="Times New Roman" w:cs="Times New Roman"/>
                 <w:i/>
                 <w:iCs/>
-                <w:sz w:val="26"/>
-                <w:szCs w:val="26"/>
+                <w:sz w:val="28"/>
+                <w:szCs w:val="28"/>
               </w:rPr>
               <w:t xml:space="preserve">- </w:t>
             </w:r>
             <w:r>
               <w:rPr>
                 <w:rFonts w:ascii="Times New Roman" w:eastAsia="Times New Roman" w:hAnsi="Times New Roman" w:cs="Times New Roman"/>
-                <w:sz w:val="26"/>
-                <w:szCs w:val="26"/>
+                <w:sz w:val="28"/>
+                <w:szCs w:val="28"/>
               </w:rPr>
               <w:t>Chi bộ Sinh viên</w:t>
             </w:r>
@@ -467,15 +449,15 @@
               <w:spacing w:before="60" w:after="60"/>
               <w:rPr>
                 <w:rFonts w:ascii="Times New Roman" w:eastAsia="Times New Roman" w:hAnsi="Times New Roman" w:cs="Times New Roman"/>
-                <w:sz w:val="26"/>
-                <w:szCs w:val="26"/>
+                <w:sz w:val="28"/>
+                <w:szCs w:val="28"/>
               </w:rPr>
             </w:pPr>
             <w:r>
               <w:rPr>
                 <w:rFonts w:ascii="Times New Roman" w:eastAsia="Times New Roman" w:hAnsi="Times New Roman" w:cs="Times New Roman"/>
-                <w:sz w:val="26"/>
-                <w:szCs w:val="26"/>
+                <w:sz w:val="28"/>
+                <w:szCs w:val="28"/>
               </w:rPr>
               <w:t>- Đảng uỷ Trường Đại học Kinh tế</w:t>
             </w:r>
@@ -496,7 +478,7 @@
     </w:p>
     <w:p>
       <w:pPr>
-        <w:spacing w:before="120" w:after="120" w:line="360" w:lineRule="atLeast"/>
+        <w:spacing w:line="400" w:lineRule="atLeast"/>
         <w:ind w:firstLine="720"/>
         <w:jc w:val="both"/>
         <w:rPr>
@@ -558,7 +540,7 @@
           </w:tcPr>
           <w:p>
             <w:pPr>
-              <w:spacing w:before="120" w:after="120" w:line="360" w:lineRule="atLeast"/>
+              <w:spacing w:line="400" w:lineRule="atLeast"/>
               <w:jc w:val="both"/>
               <w:rPr>
                 <w:rFonts w:ascii="Times New Roman" w:eastAsia="Times New Roman" w:hAnsi="Times New Roman" w:cs="Times New Roman"/>
@@ -600,7 +582,7 @@
           </w:tcPr>
           <w:p>
             <w:pPr>
-              <w:spacing w:before="120" w:after="120" w:line="360" w:lineRule="atLeast"/>
+              <w:spacing w:line="400" w:lineRule="atLeast"/>
               <w:jc w:val="both"/>
               <w:rPr>
                 <w:rFonts w:ascii="Times New Roman" w:eastAsia="Times New Roman" w:hAnsi="Times New Roman" w:cs="Times New Roman"/>
@@ -626,7 +608,7 @@
           </w:tcPr>
           <w:p>
             <w:pPr>
-              <w:spacing w:before="120" w:after="120" w:line="360" w:lineRule="atLeast"/>
+              <w:spacing w:line="400" w:lineRule="atLeast"/>
               <w:jc w:val="both"/>
               <w:rPr>
                 <w:rFonts w:ascii="Times New Roman" w:eastAsia="Times New Roman" w:hAnsi="Times New Roman" w:cs="Times New Roman"/>
@@ -651,7 +633,7 @@
           </w:tcPr>
           <w:p>
             <w:pPr>
-              <w:spacing w:before="120" w:after="120" w:line="360" w:lineRule="atLeast"/>
+              <w:spacing w:line="400" w:lineRule="atLeast"/>
               <w:jc w:val="both"/>
               <w:rPr>
                 <w:rFonts w:ascii="Times New Roman" w:eastAsia="Times New Roman" w:hAnsi="Times New Roman" w:cs="Times New Roman"/>
@@ -686,7 +668,7 @@
           </w:tcPr>
           <w:p>
             <w:pPr>
-              <w:spacing w:before="120" w:after="120" w:line="360" w:lineRule="atLeast"/>
+              <w:spacing w:line="400" w:lineRule="atLeast"/>
               <w:jc w:val="both"/>
               <w:rPr>
                 <w:rFonts w:ascii="Times New Roman" w:eastAsia="Times New Roman" w:hAnsi="Times New Roman" w:cs="Times New Roman"/>
@@ -708,7 +690,7 @@
     </w:tbl>
     <w:p>
       <w:pPr>
-        <w:spacing w:before="120" w:after="120" w:line="360" w:lineRule="atLeast"/>
+        <w:spacing w:line="400" w:lineRule="atLeast"/>
         <w:ind w:firstLine="720"/>
         <w:jc w:val="both"/>
         <w:rPr>

</xml_diff>